<commit_message>
docs: updated design document with exact team details, roll numbers, and guide Ms. J Gowri Thangam
</commit_message>
<xml_diff>
--- a/WAD_Project_Design_Document_PSG_Nexus.docx
+++ b/WAD_Project_Design_Document_PSG_Nexus.docx
@@ -57,7 +57,7 @@
     </w:p>
     <w:p>
       <w:pPr>
-        <w:spacing w:before="200" w:after="80"/>
+        <w:spacing w:before="220" w:after="80"/>
       </w:pPr>
       <w:r>
         <w:rPr>
@@ -82,15 +82,15 @@
         </w:tblBorders>
       </w:tblPr>
       <w:tblGrid>
-        <w:gridCol w:w="2412"/>
-        <w:gridCol w:w="2412"/>
-        <w:gridCol w:w="2412"/>
-        <w:gridCol w:w="2412"/>
+        <w:gridCol w:w="2448"/>
+        <w:gridCol w:w="2448"/>
+        <w:gridCol w:w="2448"/>
+        <w:gridCol w:w="2448"/>
       </w:tblGrid>
       <w:tr>
         <w:tc>
           <w:tcPr>
-            <w:tcW w:type="dxa" w:w="2412"/>
+            <w:tcW w:type="dxa" w:w="2448"/>
             <w:tcMar>
               <w:top w:w="120" w:type="dxa"/>
               <w:bottom w:w="120" w:type="dxa"/>
@@ -113,7 +113,7 @@
         </w:tc>
         <w:tc>
           <w:tcPr>
-            <w:tcW w:type="dxa" w:w="2412"/>
+            <w:tcW w:type="dxa" w:w="2448"/>
             <w:tcMar>
               <w:top w:w="120" w:type="dxa"/>
               <w:bottom w:w="120" w:type="dxa"/>
@@ -136,7 +136,7 @@
         </w:tc>
         <w:tc>
           <w:tcPr>
-            <w:tcW w:type="dxa" w:w="2412"/>
+            <w:tcW w:type="dxa" w:w="2448"/>
             <w:tcMar>
               <w:top w:w="120" w:type="dxa"/>
               <w:bottom w:w="120" w:type="dxa"/>
@@ -159,7 +159,7 @@
         </w:tc>
         <w:tc>
           <w:tcPr>
-            <w:tcW w:type="dxa" w:w="2412"/>
+            <w:tcW w:type="dxa" w:w="2448"/>
             <w:tcMar>
               <w:top w:w="120" w:type="dxa"/>
               <w:bottom w:w="120" w:type="dxa"/>
@@ -184,7 +184,7 @@
       <w:tr>
         <w:tc>
           <w:tcPr>
-            <w:tcW w:type="dxa" w:w="2412"/>
+            <w:tcW w:type="dxa" w:w="2448"/>
             <w:tcMar>
               <w:top w:w="100" w:type="dxa"/>
               <w:bottom w:w="100" w:type="dxa"/>
@@ -200,7 +200,7 @@
               <w:rPr>
                 <w:sz w:val="21"/>
               </w:rPr>
-              <w:t>Team 12</w:t>
+              <w:t>Team 1</w:t>
               <w:br/>
               <w:t>PSG Nexus</w:t>
             </w:r>
@@ -208,7 +208,7 @@
         </w:tc>
         <w:tc>
           <w:tcPr>
-            <w:tcW w:type="dxa" w:w="2412"/>
+            <w:tcW w:type="dxa" w:w="2448"/>
             <w:tcMar>
               <w:top w:w="100" w:type="dxa"/>
               <w:bottom w:w="100" w:type="dxa"/>
@@ -224,13 +224,13 @@
               <w:rPr>
                 <w:sz w:val="21"/>
               </w:rPr>
-              <w:t>26MX101</w:t>
+              <w:t>26MX209</w:t>
             </w:r>
           </w:p>
         </w:tc>
         <w:tc>
           <w:tcPr>
-            <w:tcW w:type="dxa" w:w="2412"/>
+            <w:tcW w:type="dxa" w:w="2448"/>
             <w:tcMar>
               <w:top w:w="100" w:type="dxa"/>
               <w:bottom w:w="100" w:type="dxa"/>
@@ -246,13 +246,13 @@
               <w:rPr>
                 <w:sz w:val="21"/>
               </w:rPr>
-              <w:t>Abdul Basith A</w:t>
+              <w:t>Laxman B</w:t>
             </w:r>
           </w:p>
         </w:tc>
         <w:tc>
           <w:tcPr>
-            <w:tcW w:type="dxa" w:w="2412"/>
+            <w:tcW w:type="dxa" w:w="2448"/>
             <w:tcMar>
               <w:top w:w="100" w:type="dxa"/>
               <w:bottom w:w="100" w:type="dxa"/>
@@ -268,7 +268,7 @@
               <w:rPr>
                 <w:sz w:val="21"/>
               </w:rPr>
-              <w:t>Ms. A. Kalyani</w:t>
+              <w:t>Ms. J. Gowri Thangam</w:t>
               <w:br/>
               <w:t>Assistant Professor, CA</w:t>
             </w:r>
@@ -278,7 +278,7 @@
       <w:tr>
         <w:tc>
           <w:tcPr>
-            <w:tcW w:type="dxa" w:w="2412"/>
+            <w:tcW w:type="dxa" w:w="2448"/>
             <w:tcMar>
               <w:top w:w="100" w:type="dxa"/>
               <w:bottom w:w="100" w:type="dxa"/>
@@ -294,7 +294,7 @@
               <w:rPr>
                 <w:sz w:val="21"/>
               </w:rPr>
-              <w:t>Team 12</w:t>
+              <w:t>Team 1</w:t>
               <w:br/>
               <w:t>PSG Nexus</w:t>
             </w:r>
@@ -302,7 +302,7 @@
         </w:tc>
         <w:tc>
           <w:tcPr>
-            <w:tcW w:type="dxa" w:w="2412"/>
+            <w:tcW w:type="dxa" w:w="2448"/>
             <w:tcMar>
               <w:top w:w="100" w:type="dxa"/>
               <w:bottom w:w="100" w:type="dxa"/>
@@ -318,13 +318,13 @@
               <w:rPr>
                 <w:sz w:val="21"/>
               </w:rPr>
-              <w:t>26MX102</w:t>
+              <w:t>26MX110</w:t>
             </w:r>
           </w:p>
         </w:tc>
         <w:tc>
           <w:tcPr>
-            <w:tcW w:type="dxa" w:w="2412"/>
+            <w:tcW w:type="dxa" w:w="2448"/>
             <w:tcMar>
               <w:top w:w="100" w:type="dxa"/>
               <w:bottom w:w="100" w:type="dxa"/>
@@ -346,7 +346,7 @@
         </w:tc>
         <w:tc>
           <w:tcPr>
-            <w:tcW w:type="dxa" w:w="2412"/>
+            <w:tcW w:type="dxa" w:w="2448"/>
             <w:tcMar>
               <w:top w:w="100" w:type="dxa"/>
               <w:bottom w:w="100" w:type="dxa"/>
@@ -362,7 +362,7 @@
               <w:rPr>
                 <w:sz w:val="21"/>
               </w:rPr>
-              <w:t>Ms. A. Kalyani</w:t>
+              <w:t>Ms. J. Gowri Thangam</w:t>
               <w:br/>
               <w:t>Assistant Professor, CA</w:t>
             </w:r>
@@ -372,7 +372,7 @@
       <w:tr>
         <w:tc>
           <w:tcPr>
-            <w:tcW w:type="dxa" w:w="2412"/>
+            <w:tcW w:type="dxa" w:w="2448"/>
             <w:tcMar>
               <w:top w:w="100" w:type="dxa"/>
               <w:bottom w:w="100" w:type="dxa"/>
@@ -388,7 +388,7 @@
               <w:rPr>
                 <w:sz w:val="21"/>
               </w:rPr>
-              <w:t>Team 12</w:t>
+              <w:t>Team 1</w:t>
               <w:br/>
               <w:t>PSG Nexus</w:t>
             </w:r>
@@ -396,7 +396,7 @@
         </w:tc>
         <w:tc>
           <w:tcPr>
-            <w:tcW w:type="dxa" w:w="2412"/>
+            <w:tcW w:type="dxa" w:w="2448"/>
             <w:tcMar>
               <w:top w:w="100" w:type="dxa"/>
               <w:bottom w:w="100" w:type="dxa"/>
@@ -412,13 +412,13 @@
               <w:rPr>
                 <w:sz w:val="21"/>
               </w:rPr>
-              <w:t>26MX103</w:t>
+              <w:t>26MX115</w:t>
             </w:r>
           </w:p>
         </w:tc>
         <w:tc>
           <w:tcPr>
-            <w:tcW w:type="dxa" w:w="2412"/>
+            <w:tcW w:type="dxa" w:w="2448"/>
             <w:tcMar>
               <w:top w:w="100" w:type="dxa"/>
               <w:bottom w:w="100" w:type="dxa"/>
@@ -434,13 +434,13 @@
               <w:rPr>
                 <w:sz w:val="21"/>
               </w:rPr>
-              <w:t>Laxman R</w:t>
+              <w:t>Mohamed Abdul Basith A A</w:t>
             </w:r>
           </w:p>
         </w:tc>
         <w:tc>
           <w:tcPr>
-            <w:tcW w:type="dxa" w:w="2412"/>
+            <w:tcW w:type="dxa" w:w="2448"/>
             <w:tcMar>
               <w:top w:w="100" w:type="dxa"/>
               <w:bottom w:w="100" w:type="dxa"/>
@@ -456,7 +456,7 @@
               <w:rPr>
                 <w:sz w:val="21"/>
               </w:rPr>
-              <w:t>Ms. A. Kalyani</w:t>
+              <w:t>Ms. J. Gowri Thangam</w:t>
               <w:br/>
               <w:t>Assistant Professor, CA</w:t>
             </w:r>
@@ -466,7 +466,7 @@
     </w:tbl>
     <w:p>
       <w:pPr>
-        <w:spacing w:before="200" w:after="80"/>
+        <w:spacing w:before="220" w:after="80"/>
       </w:pPr>
       <w:r>
         <w:rPr>
@@ -491,12 +491,12 @@
         </w:tblBorders>
       </w:tblPr>
       <w:tblGrid>
-        <w:gridCol w:w="9648"/>
+        <w:gridCol w:w="9792"/>
       </w:tblGrid>
       <w:tr>
         <w:tc>
           <w:tcPr>
-            <w:tcW w:type="dxa" w:w="9648"/>
+            <w:tcW w:type="dxa" w:w="9792"/>
             <w:tcMar>
               <w:top w:w="140" w:type="dxa"/>
               <w:bottom w:w="140" w:type="dxa"/>
@@ -513,7 +513,7 @@
                 <w:b/>
                 <w:sz w:val="22"/>
               </w:rPr>
-              <w:t>PSG NEXUS – Intelligent Role-Based Campus Digital Assistant and Navigation Portal for PSG College of Technology</w:t>
+              <w:t>PSG Nexus (Chat-Bot)</w:t>
             </w:r>
           </w:p>
         </w:tc>
@@ -521,7 +521,7 @@
     </w:tbl>
     <w:p>
       <w:pPr>
-        <w:spacing w:before="200" w:after="80"/>
+        <w:spacing w:before="220" w:after="80"/>
       </w:pPr>
       <w:r>
         <w:rPr>
@@ -546,12 +546,12 @@
         </w:tblBorders>
       </w:tblPr>
       <w:tblGrid>
-        <w:gridCol w:w="9648"/>
+        <w:gridCol w:w="9792"/>
       </w:tblGrid>
       <w:tr>
         <w:tc>
           <w:tcPr>
-            <w:tcW w:type="dxa" w:w="9648"/>
+            <w:tcW w:type="dxa" w:w="9792"/>
             <w:tcMar>
               <w:top w:w="140" w:type="dxa"/>
               <w:bottom w:w="140" w:type="dxa"/>
@@ -567,13 +567,13 @@
               <w:rPr>
                 <w:sz w:val="21"/>
               </w:rPr>
-              <w:t>PSG College of Technology is a large autonomous institution with many departments, academic regulations, and student services. Currently, when students, parents, or visitors visit the college website, finding specific details like attendance rules, internal Continuous Assessment (CA) calculation, syllabus copies, hostel gate rules, or certificate application forms requires clicking through multiple nested menus and reading through long PDF circulars.</w:t>
+              <w:t>PSG Nexus is a helpful digital assistant created just for the PSG College website. Our main goal is to give quick and personalized support to students, teachers, parents, alumni, and visitors based on what they need. It acts as a single, easy-to-use guide where users can find reliable information about courses, academic departments, admissions, college events, fee details, syllabus copies, campus facilities, and other important institutional resources.</w:t>
               <w:br/>
               <w:br/>
-              <w:t>PSG Nexus is developed to solve this issue by providing a single-point interactive digital assistant directly on the campus portal. We built a responsive replica of the official PSG Tech website matching the institutional identity, with an AI assistant floating at the bottom-left corner. The assistant is built using Node.js, Express, EJS templates, Bootstrap 5, and JavaScript. It provides immediate, human-friendly answers to frequent college questions and can automatically redirect users to dedicated pages—such as the Online Form Filling Portal or the Syllabus Repository—while keeping the chat window open and preserving conversation history through browser session storage.</w:t>
+              <w:t>This tool lets users easily move around the college website while the assistant stays active on the screen to help them at any time. Unlike conventional chatbots that reset upon opening another webpage, PSG Nexus maintains session continuity using browser session storage, meaning you get continuous support and clear directions without having to search for things manually or retype questions. The system also introduces intelligent page redirection—for instance, when a user asks to fill a bonafide or hostel leave form, the chatbot directs them straight to the Online Forms Portal while keeping the conversation open.</w:t>
               <w:br/>
               <w:br/>
-              <w:t>The application also implements role-based access control. While students can readily access academic guidelines, exam schedules, and certificate request forms, sensitive faculty documents such as academic council meeting minutes and staff payroll records are strictly restricted from student view. Furthermore, all student interactions are logged in real time to a local MongoDB database, allowing college administrators to identify common student issues and continuously improve campus support.</w:t>
+              <w:t>Additionally, role-based access ensures that while students and visitors receive clear public guidance on academics and hostel rules, confidential staff circulars remain restricted. All queries and interactions are stored in a local MongoDB database to help the college understand student requirements. By providing fast and trustworthy answers, PSG Nexus makes using the website a much better experience and helps build a more connected and efficient digital campus for everyone.</w:t>
             </w:r>
           </w:p>
         </w:tc>
@@ -581,7 +581,7 @@
     </w:tbl>
     <w:p>
       <w:pPr>
-        <w:spacing w:before="200" w:after="80"/>
+        <w:spacing w:before="220" w:after="80"/>
       </w:pPr>
       <w:r>
         <w:rPr>
@@ -606,12 +606,12 @@
         </w:tblBorders>
       </w:tblPr>
       <w:tblGrid>
-        <w:gridCol w:w="9648"/>
+        <w:gridCol w:w="9792"/>
       </w:tblGrid>
       <w:tr>
         <w:tc>
           <w:tcPr>
-            <w:tcW w:type="dxa" w:w="9648"/>
+            <w:tcW w:type="dxa" w:w="9792"/>
             <w:tcMar>
               <w:top w:w="140" w:type="dxa"/>
               <w:bottom w:w="140" w:type="dxa"/>
@@ -635,7 +635,7 @@
               <w:rPr>
                 <w:sz w:val="21"/>
               </w:rPr>
-              <w:t>• Description: The official portal of PSG Tech acts as the central information repository for the college. It publishes college news, admission announcements, tenders, department details, and links to external portals like Studzone. However, it is purely a static informational website with traditional dropdown navigation. There is no automated help assistant or search chatbot. When first-year students or parents visit the portal, they often struggle to locate specific information such as hostel rules, condonation criteria, or fee payment procedures without manually searching across multiple sub-pages.</w:t>
+              <w:t>• Description: The official portal of PSG Tech acts as the central information repository for the college. It publishes college news, admission announcements, tenders, department details, and links to external portals. However, it is a static informational website with traditional dropdown navigation and does not have any chatbot or automated assistant. When first-year students or parents visit the portal, they have to navigate the site by themselves and find specific information (like hostel rules or fee procedures) manually by clicking through multiple sub-pages, which can be time-consuming.</w:t>
               <w:br/>
               <w:br/>
             </w:r>
@@ -644,14 +644,14 @@
                 <w:b/>
                 <w:sz w:val="21"/>
               </w:rPr>
-              <w:t>2. Anna University Student COE Web Portal (Link: https://coe1.annauniv.edu/)</w:t>
+              <w:t>2. PSG Tech Studzone / Student Services Portal (Link: https://studzone.psgtech.ac.in/)</w:t>
               <w:br/>
             </w:r>
             <w:r>
               <w:rPr>
                 <w:sz w:val="21"/>
               </w:rPr>
-              <w:t>• Description: The Controller of Examinations portal of Anna University is used by affiliated and autonomous college students to check exam schedules, internal marks, and semester results. While it serves transactional examination needs, it lacks any interactive guidance mechanism. If a student has doubts regarding grade point formulas, revaluation timelines, or photocopy requests, there is no conversational support available to guide them to the correct procedure.</w:t>
+              <w:t>• Description: Studzone is the primary student portal used by PSG Tech students for viewing internal marks, attendance logs, and exam fee payments. While it serves transactional academic requirements, it lacks any conversational guidance or virtual helpdesk. If a student has questions regarding attendance condonation limits (65%-74%), CAT assessment weightage, or how to apply for bonafide certificates, they must either consult the academic handbook or visit the department office in person. There is no instant digital assistant to guide them directly to the appropriate form or procedure.</w:t>
             </w:r>
           </w:p>
         </w:tc>
@@ -659,7 +659,7 @@
     </w:tbl>
     <w:p>
       <w:pPr>
-        <w:spacing w:before="200" w:after="80"/>
+        <w:spacing w:before="220" w:after="80"/>
       </w:pPr>
       <w:r>
         <w:rPr>
@@ -684,12 +684,12 @@
         </w:tblBorders>
       </w:tblPr>
       <w:tblGrid>
-        <w:gridCol w:w="9648"/>
+        <w:gridCol w:w="9792"/>
       </w:tblGrid>
       <w:tr>
         <w:tc>
           <w:tcPr>
-            <w:tcW w:type="dxa" w:w="9648"/>
+            <w:tcW w:type="dxa" w:w="9792"/>
             <w:tcMar>
               <w:top w:w="140" w:type="dxa"/>
               <w:bottom w:w="140" w:type="dxa"/>
@@ -705,17 +705,17 @@
               <w:rPr>
                 <w:sz w:val="21"/>
               </w:rPr>
-              <w:t>1. To develop a responsive web portal representing PSG College of Technology with an integrated, floating AI digital assistant.</w:t>
+              <w:t>• To develop an intelligent, context-aware chatbot serving as a unified digital guide for the PSG College ecosystem.</w:t>
               <w:br/>
-              <w:t>2. To provide quick, 100% accurate responses to routine college questions regarding minimum attendance (75%), CAT continuous assessment calculations (50 marks), autonomous grading scales, hostel rules, and placement statistics.</w:t>
+              <w:t>• To deliver instant, 24/7 access to crucial institutional information regarding academics, admissions, fees, and campus amenities.</w:t>
               <w:br/>
-              <w:t>3. To implement an automated page redirection feature that smoothly guides users to relevant pages (e.g., from Home to the Online Form Filling Portal) while preserving conversation state and keeping the chat window open using browser sessionStorage.</w:t>
+              <w:t>• To elevate the user experience (UX) by significantly reducing the time required to retrieve syllabus, circulars, and form details.</w:t>
               <w:br/>
-              <w:t>4. To enforce role-based access control (RBAC) so that authenticated faculty members can view internal meeting records, while students and visitors are restricted from viewing confidential files.</w:t>
+              <w:t>• To implement tailored, role-based assistance addressing the varying intents of students, faculty, parents, alumni, and visitors.</w:t>
               <w:br/>
-              <w:t>5. To include an out-of-scope guardrail filter that ensures the chatbot remains professional and answers only questions related to the college and campus life.</w:t>
+              <w:t>• To enable automated in-browser page redirection (e.g., navigating directly to the Online Forms Portal or Syllabus repository) while keeping the chatbot session continuously active and conversations preserved across page transitions.</w:t>
               <w:br/>
-              <w:t>6. To store all conversations, roles, queries, and server responses in a local MongoDB database so that campus administrators can view student queries directly using MongoDB Compass.</w:t>
+              <w:t>• To safeguard institutional confidentiality through role-based access control, ensuring students cannot access private staff files, and logging all conversation data to local MongoDB storage for administrative review.</w:t>
             </w:r>
           </w:p>
         </w:tc>
@@ -723,7 +723,7 @@
     </w:tbl>
     <w:p>
       <w:pPr>
-        <w:spacing w:before="200" w:after="80"/>
+        <w:spacing w:before="220" w:after="80"/>
       </w:pPr>
       <w:r>
         <w:rPr>
@@ -748,12 +748,12 @@
         </w:tblBorders>
       </w:tblPr>
       <w:tblGrid>
-        <w:gridCol w:w="9648"/>
+        <w:gridCol w:w="9792"/>
       </w:tblGrid>
       <w:tr>
         <w:tc>
           <w:tcPr>
-            <w:tcW w:type="dxa" w:w="9648"/>
+            <w:tcW w:type="dxa" w:w="9792"/>
             <w:tcMar>
               <w:top w:w="140" w:type="dxa"/>
               <w:bottom w:w="140" w:type="dxa"/>
@@ -771,20 +771,20 @@
               </w:rPr>
               <w:t>• Scope:</w:t>
               <w:br/>
-              <w:t>The project is designed for the students, faculty members, parents, alumni, and prospective visitors of PSG College of Technology. It acts as a 24/7 digital campus guide and automated navigation hub across web browsers on desktops, laptops, and mobile devices.</w:t>
+              <w:t>The application is integrated as a persistent, floating interactive widget in the bottom-left corner of the PSG College website. It covers key institutional domains including departmental directories, syllabus repositories, admission guidelines, campus events, hostel rules, and online student form filling services.</w:t>
               <w:br/>
               <w:br/>
-              <w:t>• Practical Use:</w:t>
+              <w:t>• Use Cases:</w:t>
               <w:br/>
-              <w:t>1. For Students: Instantly clarify attendance rules, internal assessment weightage, library book limits, hostel in-times (8:30 PM), and navigate straight to the online form filling portal to request Bonafide certificates or hall tickets.</w:t>
+              <w:t>1. Prospective Students &amp; Parents: Navigating admission procedures, checking TNEA cutoff trends, understanding fee structures, and exploring hostel/campus facilities.</w:t>
               <w:br/>
-              <w:t>2. For Parents: Quickly access tuition and hostel fee payment schedules, hostel warden phone numbers, and TNEA cutoff trends without confusion.</w:t>
+              <w:t>2. Current Students: Clarifying attendance criteria (75%), Continuous Assessment marks (CAT), CGPA calculation, hostel in-times (8:30 PM), and submitting requests for Bonafide certificates or duplicate hall tickets.</w:t>
               <w:br/>
-              <w:t>3. For Faculty: Obtain quick access to leave application forms, syllabus revision guidelines, and department meeting notices.</w:t>
+              <w:t>3. Faculty &amp; Staff: Obtaining quick access to leave application procedures, academic council schedules, and syllabus revision memos.</w:t>
               <w:br/>
-              <w:t>4. For Visitors &amp; Applicants: Learn about autonomous degree programmes, NAAC A+ accreditation status, NIRF ranking, and campus directions.</w:t>
+              <w:t>4. Visitors &amp; Alumni: Accessing campus directions, alumni association updates (Laudea), and institutional NIRF / NAAC accreditation details.</w:t>
               <w:br/>
-              <w:t>5. For College Administration: Monitor student queries via MongoDB Compass to understand common difficulties and post timely announcements.</w:t>
+              <w:t>5. Campus Administration: Viewing stored conversation logs in MongoDB Compass to recognize frequently asked student queries and address bottlenecks.</w:t>
             </w:r>
           </w:p>
         </w:tc>
@@ -792,7 +792,7 @@
     </w:tbl>
     <w:p>
       <w:pPr>
-        <w:spacing w:before="200" w:after="80"/>
+        <w:spacing w:before="220" w:after="80"/>
       </w:pPr>
       <w:r>
         <w:rPr>
@@ -819,12 +819,12 @@
         </w:tblBorders>
       </w:tblPr>
       <w:tblGrid>
-        <w:gridCol w:w="9648"/>
+        <w:gridCol w:w="9792"/>
       </w:tblGrid>
       <w:tr>
         <w:tc>
           <w:tcPr>
-            <w:tcW w:type="dxa" w:w="9648"/>
+            <w:tcW w:type="dxa" w:w="9792"/>
             <w:tcMar>
               <w:top w:w="140" w:type="dxa"/>
               <w:bottom w:w="140" w:type="dxa"/>
@@ -842,37 +842,39 @@
               </w:rPr>
               <w:t>• Frontend Technologies:</w:t>
               <w:br/>
-              <w:t xml:space="preserve">  - HTML5 &amp; CSS3: Structuring web pages and applying custom PSG Tech brand styling (Navy Blue #2B4BAB and Gold #F4DE88).</w:t>
+              <w:t xml:space="preserve">  - HTML5 &amp; CSS3: Page structuring and responsive layout conforming to the official PSG Tech website design.</w:t>
               <w:br/>
-              <w:t xml:space="preserve">  - Bootstrap 5.3 Framework: Building responsive navigation bars, carousels, cards, grids, and dialog modals.</w:t>
+              <w:t xml:space="preserve">  - Bootstrap 5.3: Responsive navigation bars, hero carousel, cards, and modal dialogs with PSG brand styling.</w:t>
               <w:br/>
-              <w:t xml:space="preserve">  - Vanilla JavaScript (ES6): Handling DOM manipulation, client-side event listeners, typing animations, and redirection timers.</w:t>
+              <w:t xml:space="preserve">  - JavaScript (ES6): Interactive client-side behavior, floating widget toggling, auto-redirection timers, and input validation.</w:t>
               <w:br/>
               <w:br/>
-              <w:t>• Templating &amp; Server Architecture:</w:t>
+              <w:t>• Server-Side &amp; Templating Engine:</w:t>
               <w:br/>
-              <w:t xml:space="preserve">  - EJS (Embedded JavaScript): Dynamic server-side rendering with reusable layout partials (header.ejs, footer.ejs, chatbot.ejs).</w:t>
+              <w:t xml:space="preserve">  - Node.js: Cross-platform, asynchronous JavaScript runtime environment for executing the backend script.</w:t>
               <w:br/>
-              <w:t xml:space="preserve">  - Node.js &amp; Express.js: Robust backend runtime and web server managing routing, static files, and the /api/chat endpoint.</w:t>
+              <w:t xml:space="preserve">  - Express.js: Web application framework for handling HTTP routing, static asset serving, and RESTful API endpoints (/api/chat).</w:t>
+              <w:br/>
+              <w:t xml:space="preserve">  - EJS (Embedded JavaScript): Template engine for server-side dynamic rendering with shared partials (header.ejs, footer.ejs, chatbot.ejs).</w:t>
               <w:br/>
               <w:br/>
-              <w:t>• Session &amp; State Management:</w:t>
+              <w:t>• Client-Side Session &amp; State Management:</w:t>
               <w:br/>
-              <w:t xml:space="preserve">  - Browser sessionStorage: Preserving active chat logs, current user role, and open/closed widget state across multi-page navigation.</w:t>
+              <w:t xml:space="preserve">  - Browser sessionStorage: Preserves conversation history, user role, and widget visibility across page navigation without database reload overhead.</w:t>
               <w:br/>
               <w:br/>
               <w:t>• Database &amp; Storage:</w:t>
               <w:br/>
-              <w:t xml:space="preserve">  - MongoDB (Local Storage): Storing conversation documents, timestamps, and roles in 'psgnexus_db' via Mongoose ODM.</w:t>
+              <w:t xml:space="preserve">  - MongoDB (Local Storage): Document-oriented database for logging chat sessions, roles, timestamps, and status into 'psgnexus_db'.</w:t>
               <w:br/>
-              <w:t xml:space="preserve">  - MongoDB Compass: Desktop GUI tool used for inspecting live student query records.</w:t>
+              <w:t xml:space="preserve">  - MongoDB Compass: Official GUI client used to inspect and verify stored conversation collections.</w:t>
               <w:br/>
               <w:br/>
-              <w:t>• AI &amp; Natural Language Processing:</w:t>
+              <w:t>• AI / NLP Engine:</w:t>
               <w:br/>
-              <w:t xml:space="preserve">  - Built-in Campus Knowledge Engine: Local keyword scoring and intent classification for instant offline answers during reviews.</w:t>
+              <w:t xml:space="preserve">  - Built-in Campus Knowledge Engine: Local keyword-scoring algorithm delivering fast, offline-ready answers to 50+ college topics.</w:t>
               <w:br/>
-              <w:t xml:space="preserve">  - Google GenAI SDK (@google/genai): Free-tier integration with Gemini 1.5 Flash for answering open-ended campus questions.</w:t>
+              <w:t xml:space="preserve">  - Google GenAI SDK (@google/genai): Integration with Gemini 1.5 Flash for answering open-ended campus queries.</w:t>
             </w:r>
           </w:p>
         </w:tc>
@@ -880,7 +882,7 @@
     </w:tbl>
     <w:p>
       <w:pPr>
-        <w:spacing w:before="200" w:after="80"/>
+        <w:spacing w:before="220" w:after="80"/>
       </w:pPr>
       <w:r>
         <w:rPr>
@@ -905,12 +907,12 @@
         </w:tblBorders>
       </w:tblPr>
       <w:tblGrid>
-        <w:gridCol w:w="9648"/>
+        <w:gridCol w:w="9792"/>
       </w:tblGrid>
       <w:tr>
         <w:tc>
           <w:tcPr>
-            <w:tcW w:type="dxa" w:w="9648"/>
+            <w:tcW w:type="dxa" w:w="9792"/>
             <w:tcMar>
               <w:top w:w="140" w:type="dxa"/>
               <w:bottom w:w="140" w:type="dxa"/>
@@ -926,21 +928,19 @@
               <w:rPr>
                 <w:sz w:val="20"/>
               </w:rPr>
-              <w:t>1. Institutional Role Management: The application defaults to the 'Student' role for immediate use, while allowing users to switch between Student, Faculty, Parent, and Visitor roles via an in-chat selector.</w:t>
+              <w:t>1. Role Identification &amp; Intent Recognition: The system defaults to the 'Student' role for immediate usability and accurately categorizes user queries, tailoring responses based on the user's role (Student, Faculty, Parent, Visitor).</w:t>
               <w:br/>
-              <w:t>2. Campus Question Answering: The chatbot processes user text and provides structured answers regarding attendance rules (75%), Continuous Assessment tests (CAT), autonomous GPA calculations, hostel timings (8:30 PM), library facilities, and placements.</w:t>
+              <w:t>2. Continuous Session Management: The chatbot maintains conversational context and persists across different pages of the website using browser sessionStorage without resetting or losing previous chat messages.</w:t>
               <w:br/>
-              <w:t>3. Out-of-Scope Query Guardrail: The backend scans incoming messages for non-college topics (e.g., movies, gaming, politics, external programming) and returns a polite refusal message reminding users to ask campus-related questions.</w:t>
+              <w:t>3. Automated Page Redirection: The system detects navigation requests (e.g., 'take me to form filling page' or 'show syllabus') and triggers automatic redirection with a countdown banner while keeping the chat open.</w:t>
               <w:br/>
-              <w:t>4. Role-Based Document Access Control: If a student asks for confidential faculty files (e.g., academic council meeting minutes or staff payroll), the system rejects the request with an 'Access Restricted' warning, but approves it when queried under the Faculty role.</w:t>
+              <w:t>4. Out-of-Scope Boundary Guardrail: Queries unrelated to PSG Tech (such as entertainment, general sports, or external coding) are filtered out and handled with a polite refusal prompting the user to ask college-related questions.</w:t>
               <w:br/>
-              <w:t>5. Automated Multi-Page Redirection: When the user requests a specific section (e.g., 'take me to form filling page' or 'show syllabus'), the chatbot displays a confirmation with an animated progress bar and redirects the browser window to that page.</w:t>
+              <w:t>5. Role-Based Document Access Control: Confidential faculty records (e.g., academic council meeting minutes or staff payroll) are restricted when queried under Student/Visitor roles and approved only for verified Faculty sessions.</w:t>
               <w:br/>
-              <w:t>6. Cross-Page Session Persistence: The conversation history, active role, and widget visibility are saved in sessionStorage, ensuring the chat stays open and continues seamlessly after redirecting to another page.</w:t>
+              <w:t>6. Local Database Logging: Every conversation exchange (user query, bot response, user role, status, and timestamp) is stored asynchronously in local MongoDB under the 'conversations' collection.</w:t>
               <w:br/>
-              <w:t>7. Database Logging: Every user message, role, response, and timestamp are saved asynchronously into MongoDB under the 'conversations' collection.</w:t>
-              <w:br/>
-              <w:t>8. Online Form Filling Services: A functional forms portal where students can submit online requests for Bonafide certificates, hostel outing slips, and duplicate hall tickets with confirmation popups.</w:t>
+              <w:t>7. Online Form Submission Services: Provides interactive student service forms for Bonafide certificates, hostel outing passes, and duplicate hall tickets with dynamic reference ID generation.</w:t>
             </w:r>
           </w:p>
         </w:tc>
@@ -948,7 +948,7 @@
     </w:tbl>
     <w:p>
       <w:pPr>
-        <w:spacing w:before="200" w:after="80"/>
+        <w:spacing w:before="220" w:after="80"/>
       </w:pPr>
       <w:r>
         <w:rPr>
@@ -973,12 +973,12 @@
         </w:tblBorders>
       </w:tblPr>
       <w:tblGrid>
-        <w:gridCol w:w="9648"/>
+        <w:gridCol w:w="9792"/>
       </w:tblGrid>
       <w:tr>
         <w:tc>
           <w:tcPr>
-            <w:tcW w:type="dxa" w:w="9648"/>
+            <w:tcW w:type="dxa" w:w="9792"/>
             <w:tcMar>
               <w:top w:w="140" w:type="dxa"/>
               <w:bottom w:w="140" w:type="dxa"/>
@@ -994,17 +994,15 @@
               <w:rPr>
                 <w:sz w:val="20"/>
               </w:rPr>
-              <w:t>1. Usability &amp; User Experience: The portal faithfully replicates the official PSG Tech website design (&gt;90% match) with clean typography, accessible navigation, and an intuitive bottom-left floating chatbot with animated pulse indicators.</w:t>
+              <w:t>• Performance: Chatbot response time must be under 1.5 seconds (under 50ms for local knowledge base matching) to ensure a fluid conversational experience.</w:t>
               <w:br/>
-              <w:t>2. Performance &amp; Speed: Local knowledge base matches respond within 50 milliseconds, providing an instant conversational experience without noticeable latency.</w:t>
+              <w:t>• Availability &amp; Offline Reliability: The system architecture guarantees high availability and includes complete offline operational capability during lab reviews and network downtimes.</w:t>
               <w:br/>
-              <w:t>3. Offline Reliability: The application runs completely offline during lab tests and viva evaluations using its local database and knowledge engine, ensuring zero dependency on live internet connectivity.</w:t>
+              <w:t>• Usability: The UI widget is non-intrusive, placed at the bottom-left with intuitive launcher icons, clear typography, and responsive layout across desktop, tablet, and mobile devices.</w:t>
               <w:br/>
-              <w:t>4. Security &amp; Privacy: Sensitive faculty information is protected through role-based access rules, and secret API keys are kept safely in server environment variables.</w:t>
+              <w:t>• Visual Consistency: The web portal closely replicates (&gt;90% match) the visual identity of the official PSG College of Technology website (Royal Blue #2B4BAB and Gold accents).</w:t>
               <w:br/>
-              <w:t>5. Cross-Browser Compatibility: Compatible across major modern web browsers including Google Chrome, Mozilla Firefox, Microsoft Edge, and Safari.</w:t>
-              <w:br/>
-              <w:t>6. Maintainability: Structured using standard Model-View-Controller (MVC) principles with clean separation between EJS views, static assets, and Express route controllers.</w:t>
+              <w:t>• Security &amp; Privacy: Role-based authorization prevents unauthorized access to internal staff records. All sensitive server keys are maintained securely in environment variables.</w:t>
             </w:r>
           </w:p>
         </w:tc>
@@ -1012,7 +1010,7 @@
     </w:tbl>
     <w:p>
       <w:pPr>
-        <w:spacing w:before="200" w:after="80"/>
+        <w:spacing w:before="220" w:after="80"/>
       </w:pPr>
       <w:r>
         <w:rPr>
@@ -1030,7 +1028,7 @@
         <w:rPr>
           <w:sz w:val="21"/>
         </w:rPr>
-        <w:t>The following diagram illustrates the complete operational workflow of the PSG Nexus application, showing role selection, query evaluation, boundary filtering, document security checks, page redirection, and dual persistence to MongoDB Compass and browser session storage:</w:t>
+        <w:t>Figure 1 illustrates the complete operational flow of the PSG Nexus application, detailing the role selection, boundary guardrail check, authorization filter, navigation intent evaluation, dual-tier response generation, and asynchronous storage into MongoDB and browser session storage:</w:t>
       </w:r>
     </w:p>
     <w:p>
@@ -1083,12 +1081,12 @@
           <w:b/>
           <w:sz w:val="20"/>
         </w:rPr>
-        <w:t>Figure 1: Complete System Flow Diagram of PSG Nexus</w:t>
+        <w:t>Figure 1: Complete System Flow Diagram of PSG Nexus Application</w:t>
       </w:r>
     </w:p>
     <w:p>
       <w:pPr>
-        <w:spacing w:before="200" w:after="80"/>
+        <w:spacing w:before="220" w:after="80"/>
       </w:pPr>
       <w:r>
         <w:rPr>
@@ -1151,7 +1149,7 @@
     </w:p>
     <w:p>
       <w:pPr>
-        <w:spacing w:after="200"/>
+        <w:spacing w:after="160"/>
         <w:jc w:val="center"/>
       </w:pPr>
       <w:r>
@@ -1215,7 +1213,7 @@
     </w:p>
     <w:p>
       <w:pPr>
-        <w:spacing w:after="200"/>
+        <w:spacing w:after="160"/>
         <w:jc w:val="center"/>
       </w:pPr>
       <w:r>
@@ -1239,7 +1237,7 @@
     </w:p>
     <w:p>
       <w:pPr>
-        <w:spacing w:before="200" w:after="80"/>
+        <w:spacing w:before="220" w:after="80"/>
       </w:pPr>
       <w:r>
         <w:rPr>
@@ -1333,13 +1331,13 @@
         </w:tblBorders>
       </w:tblPr>
       <w:tblGrid>
-        <w:gridCol w:w="4824"/>
-        <w:gridCol w:w="4824"/>
+        <w:gridCol w:w="4896"/>
+        <w:gridCol w:w="4896"/>
       </w:tblGrid>
       <w:tr>
         <w:tc>
           <w:tcPr>
-            <w:tcW w:type="dxa" w:w="4824"/>
+            <w:tcW w:type="dxa" w:w="4896"/>
           </w:tcPr>
           <w:p>
             <w:pPr>
@@ -1354,19 +1352,19 @@
               <w:br/>
               <w:br/>
               <w:br/>
-              <w:t>1. __________________________</w:t>
+              <w:t>1. __________________________ (26MX209)</w:t>
               <w:br/>
               <w:br/>
-              <w:t>2. __________________________</w:t>
+              <w:t>2. __________________________ (26MX110)</w:t>
               <w:br/>
               <w:br/>
-              <w:t>3. __________________________</w:t>
+              <w:t>3. __________________________ (26MX115)</w:t>
             </w:r>
           </w:p>
         </w:tc>
         <w:tc>
           <w:tcPr>
-            <w:tcW w:type="dxa" w:w="4824"/>
+            <w:tcW w:type="dxa" w:w="4896"/>
           </w:tcPr>
           <w:p>
             <w:pPr>
@@ -1384,7 +1382,7 @@
               <w:br/>
               <w:t>__________________________</w:t>
               <w:br/>
-              <w:t>(Ms. A. Kalyani)</w:t>
+              <w:t>(Ms. J. Gowri Thangam)</w:t>
             </w:r>
           </w:p>
         </w:tc>
@@ -1392,7 +1390,7 @@
     </w:tbl>
     <w:sectPr>
       <w:pgSz w:w="12240" w:h="15840"/>
-      <w:pgMar w:top="1152" w:right="1296" w:bottom="1152" w:left="1296" w:header="720" w:footer="720" w:gutter="0"/>
+      <w:pgMar w:top="1152" w:right="1224" w:bottom="1152" w:left="1224" w:header="720" w:footer="720" w:gutter="0"/>
       <w:cols w:space="720"/>
       <w:docGrid w:linePitch="360"/>
     </w:sectPr>

</xml_diff>